<commit_message>
Updated Education section and Editted Resume
</commit_message>
<xml_diff>
--- a/Lukhanyo_Kalashe_CV_2026.docx
+++ b/Lukhanyo_Kalashe_CV_2026.docx
@@ -962,21 +962,7 @@
           <w:b/>
           <w:bCs/>
         </w:rPr>
-        <w:t xml:space="preserve"> RAG System – Natural Language Processing (Honours)</w:t>
-      </w:r>
-      <w:r>
-        <w:tab/>
-        <w:t xml:space="preserve">      </w:t>
-      </w:r>
-      <w:r>
-        <w:rPr>
-          <w:i/>
-          <w:iCs/>
-          <w:color w:val="5C6370"/>
-          <w:sz w:val="19"/>
-          <w:szCs w:val="19"/>
-        </w:rPr>
-        <w:t>2026</w:t>
+        <w:t xml:space="preserve"> </w:t>
       </w:r>
     </w:p>
     <w:p>
@@ -988,90 +974,6 @@
         </w:numPr>
         <w:spacing w:before="40" w:after="40"/>
       </w:pPr>
-      <w:r>
-        <w:t>Engineered a Retrieval-Augmented Generation (RAG) system to automate the analysis and querying of technical software engineering course documents.</w:t>
-      </w:r>
-    </w:p>
-    <w:p>
-      <w:pPr>
-        <w:pStyle w:val="ListParagraph"/>
-        <w:numPr>
-          <w:ilvl w:val="0"/>
-          <w:numId w:val="2"/>
-        </w:numPr>
-        <w:spacing w:before="40" w:after="40"/>
-      </w:pPr>
-      <w:r>
-        <w:t>Implemented dense semantic retrieval utilizing FAISS and document embeddings to ensure high-accuracy context fetching.</w:t>
-      </w:r>
-    </w:p>
-    <w:p>
-      <w:pPr>
-        <w:pStyle w:val="ListParagraph"/>
-        <w:numPr>
-          <w:ilvl w:val="0"/>
-          <w:numId w:val="2"/>
-        </w:numPr>
-        <w:spacing w:before="40" w:after="40"/>
-      </w:pPr>
-      <w:r>
-        <w:t>Designed a hybrid search approach incorporating TF-IDF to significantly improve retrieval precision for highly technical software engineering terminology.</w:t>
-      </w:r>
-    </w:p>
-    <w:p>
-      <w:pPr>
-        <w:pStyle w:val="ListParagraph"/>
-        <w:numPr>
-          <w:ilvl w:val="0"/>
-          <w:numId w:val="2"/>
-        </w:numPr>
-        <w:spacing w:before="40" w:after="40"/>
-      </w:pPr>
-      <w:r>
-        <w:rPr>
-          <w:sz w:val="19"/>
-          <w:szCs w:val="19"/>
-        </w:rPr>
-        <w:t>Conducted bias and error analysis using LIME; applied advanced prompting and in-context learning techniques to improve system output quality.</w:t>
-      </w:r>
-    </w:p>
-    <w:p>
-      <w:pPr>
-        <w:pStyle w:val="ListParagraph"/>
-        <w:numPr>
-          <w:ilvl w:val="0"/>
-          <w:numId w:val="2"/>
-        </w:numPr>
-        <w:spacing w:before="40" w:after="40"/>
-      </w:pPr>
-      <w:r>
-        <w:rPr>
-          <w:sz w:val="19"/>
-          <w:szCs w:val="19"/>
-        </w:rPr>
-        <w:t>Co-authored an academic research paper documenting methodology and findings; delivered a formal departmental presentation of the system.</w:t>
-      </w:r>
-    </w:p>
-    <w:p>
-      <w:pPr>
-        <w:pStyle w:val="ListParagraph"/>
-        <w:numPr>
-          <w:ilvl w:val="0"/>
-          <w:numId w:val="2"/>
-        </w:numPr>
-        <w:spacing w:before="40" w:after="40"/>
-      </w:pPr>
-      <w:r>
-        <w:t xml:space="preserve">Leveraged advanced Natural Language Processing (NLP) libraries, including </w:t>
-      </w:r>
-      <w:proofErr w:type="spellStart"/>
-      <w:r>
-        <w:t>spaCy</w:t>
-      </w:r>
-      <w:proofErr w:type="spellEnd"/>
-      <w:r>
-        <w:t xml:space="preserve"> and Hugging Face Transformers, to build a robust, intelligent question-answering pipeline.</w:t>
-      </w:r>
     </w:p>
     <w:p>
       <w:pPr>

</xml_diff>